<commit_message>
docs: academic wording cleanup for final internship submission
</commit_message>
<xml_diff>
--- a/Aryan_StudentAcademicSuccessReport.docx
+++ b/Aryan_StudentAcademicSuccessReport.docx
@@ -193,10 +193,9 @@
       <w:r>
         <w:rPr>
           <w:rFonts w:ascii="Calibri" w:hAnsi="Calibri"/>
-          <w:color w:val="2C3E50"/>
           <w:sz w:val="22"/>
         </w:rPr>
-        <w:t>Student attrition in higher education diminishes university financial sustainability, depresses graduate attainment rates, and imposes substantial personal economic burdens on exiting students. This study develops a production-ready, reproducible multiclass machine learning framework to predict three student graduation outcomes: Dropout, Enrolled, and Graduate. Using the official UCI Machine Learning Repository dataset comprising 4,424 student records and 36 predictors from the Instituto Politécnico de Portalegre, we resolve the critical hazard of temporal data leakage by constructing two distinct operational paradigms: Perspective A (Pre-Enrollment Screening, 24 features available at intake) and Perspective B (Longitudinal Progress Modeling, 36 features incorporating first- and second-semester curricular evaluations). Through a 5-Fold Stratified Cross-Validation protocol across five classification families (Logistic Regression, Decision Trees, Random Forests, HistGradientBoosting, and Support Vector Classifiers), the champion model—a class-weighted Random Forest under Perspective B—achieved a test set accuracy of 74.92%, a Macro-F1 score of 0.7069, and a Dropout recall of 70.42%. In contrast, intake screening (Perspective A) attained 59.10% accuracy and a Macro-F1 of 0.5506. Explainability analysis reveals that second-semester curricular approvals and tuition fee compliance are the dominant predictors of graduation, while pre-enrollment risk is driven primarily by older matriculation age, lower entrance examination grades, and non-traditional admissions modes. These empirical findings validate a two-tiered institutional retention strategy combining pre-matriculation financial counseling with intensive mid-year academic advising.</w:t>
+        <w:t>Student attrition in higher education diminishes university financial sustainability, depresses graduate attainment rates, and imposes substantial personal economic burdens on exiting students. This study develops an end-to-end, reproducible multiclass machine learning framework to predict three student graduation outcomes: Dropout, Enrolled, and Graduate. Using the official UCI Machine Learning Repository dataset comprising 4,424 student records and 36 predictors from the Instituto Politécnico de Portalegre, we resolve the critical hazard of temporal data leakage by constructing two distinct operational paradigms: Perspective A (Pre-Enrollment Screening, 24 features available at intake) and Perspective B (Longitudinal Progress Modeling, 36 features incorporating first- and second-semester curricular evaluations). Through a 5-Fold Stratified Cross-Validation protocol evaluating five supervised learning classification families (Logistic Regression, Decision Trees, Random Forests, HistGradientBoosting, and Support Vector Classifiers) alongside a stratified DummyClassifier baseline, the champion model—a class-weighted Random Forest under Perspective B—achieved a test set accuracy of 74.92%, a Macro-F1 score of 0.7069, and a Dropout recall of 70.42%. In contrast, intake screening (Perspective A) attained 59.10% accuracy and a Macro-F1 of 0.5506. Explainability analysis reveals that second-semester curricular approvals and tuition fee compliance are the dominant predictors of graduation, while pre-enrollment risk is driven primarily by older matriculation age, lower entrance examination grades, and non-traditional admissions modes. These empirical findings validate a two-tiered institutional retention strategy combining pre-matriculation financial counseling with intensive mid-year academic advising.</w:t>
       </w:r>
     </w:p>
     <w:p>
@@ -4219,10 +4218,9 @@
       <w:r>
         <w:rPr>
           <w:rFonts w:ascii="Calibri" w:hAnsi="Calibri"/>
-          <w:color w:val="2C3E50"/>
           <w:sz w:val="22"/>
         </w:rPr>
-        <w:t>We trained five supervised learning algorithm families, each configured with class_weight='balanced' to handle the moderate class imbalance:</w:t>
+        <w:t>Five supervised learning model families were evaluated alongside a stratified DummyClassifier baseline, each substantive model configured with class_weight='balanced' to handle the moderate class imbalance:</w:t>
       </w:r>
     </w:p>
     <w:p>
@@ -6628,10 +6626,9 @@
       <w:r>
         <w:rPr>
           <w:rFonts w:ascii="Calibri" w:hAnsi="Calibri"/>
-          <w:color w:val="2C3E50"/>
           <w:sz w:val="22"/>
         </w:rPr>
-        <w:t>Financial Viability: Tuition fees up to date ranks among the top non-curricular features, confirming that inability to maintain tuition fee schedules is directly coupled with departure.</w:t>
+        <w:t>Financial Viability: Tuition fees up to date ranks among the top non-curricular features, confirming that inability to maintain tuition fee schedules shows a strong relationship with departure.</w:t>
       </w:r>
     </w:p>
     <w:p>
@@ -6695,18 +6692,17 @@
         <w:rPr>
           <w:rFonts w:ascii="Calibri" w:hAnsi="Calibri"/>
           <w:b/>
-          <w:color w:val="2C3E50"/>
           <w:sz w:val="22"/>
         </w:rPr>
-        <w:t xml:space="preserve">2. Financial Fragility: </w:t>
+        <w:t xml:space="preserve">2. Financial Viability: </w:t>
       </w:r>
       <w:r>
         <w:rPr>
           <w:rFonts w:ascii="Calibri" w:hAnsi="Calibri"/>
-          <w:color w:val="2C3E50"/>
+          <w:b w:val="0"/>
           <w:sz w:val="22"/>
         </w:rPr>
-        <w:t>Fee Defaults as Urgent Early Warning: Tuition overdue status is an acute indicator of dropout risk (86.55% dropout rate). Automated notifications generated at the finance office should immediately trigger student aid outreach.</w:t>
+        <w:t>Tuition Fee Status Shows a Strong Association with Dropout: Tuition overdue status exhibits a strong observed association with dropout risk (86.55% observed dropout rate). This association could be explored as a potential signal for targeted financial-support interventions.</w:t>
       </w:r>
     </w:p>
     <w:p>
@@ -6718,7 +6714,6 @@
         <w:rPr>
           <w:rFonts w:ascii="Calibri" w:hAnsi="Calibri"/>
           <w:b/>
-          <w:color w:val="2C3E50"/>
           <w:sz w:val="22"/>
         </w:rPr>
         <w:t xml:space="preserve">3. Non-Traditional Demographics: </w:t>
@@ -6726,10 +6721,10 @@
       <w:r>
         <w:rPr>
           <w:rFonts w:ascii="Calibri" w:hAnsi="Calibri"/>
-          <w:color w:val="2C3E50"/>
+          <w:b w:val="0"/>
           <w:sz w:val="22"/>
         </w:rPr>
-        <w:t>Elevated Vulnerability of Non-Traditional Students: Older students enrolling via special entrance contingents experience elevated dropout rates, indicating the need for flexible scheduling and peer mentoring programs.</w:t>
+        <w:t>Higher Observed Dropout Rates Among Older Students: Older students enrolling via special entrance contingents experience elevated observed dropout rates, indicating the value of flexible scheduling and tailored peer mentoring programs.</w:t>
       </w:r>
     </w:p>
     <w:p>

</xml_diff>